<commit_message>
Enhance HR module with new routes for approved forms and document generation. Added functionality for printing and downloading HR documents in DOCX format. Updated templates to improve user experience with new buttons for document actions and streamlined navigation. Refactored existing code for clarity and removed outdated elements.
</commit_message>
<xml_diff>
--- a/HR Documents/Commencement Form - INJAAZ.DOCX
+++ b/HR Documents/Commencement Form - INJAAZ.DOCX
@@ -2,190 +2,83 @@
 <file path=word/document.xml><?xml version="1.0" encoding="utf-8"?>
 <w:document xmlns:wpc="http://schemas.microsoft.com/office/word/2010/wordprocessingCanvas" xmlns:mc="http://schemas.openxmlformats.org/markup-compatibility/2006" xmlns:o="urn:schemas-microsoft-com:office:office" xmlns:r="http://schemas.openxmlformats.org/officeDocument/2006/relationships" xmlns:m="http://schemas.openxmlformats.org/officeDocument/2006/math" xmlns:v="urn:schemas-microsoft-com:vml" xmlns:wp14="http://schemas.microsoft.com/office/word/2010/wordprocessingDrawing" xmlns:wp="http://schemas.openxmlformats.org/drawingml/2006/wordprocessingDrawing" xmlns:w10="urn:schemas-microsoft-com:office:word" xmlns:w="http://schemas.openxmlformats.org/wordprocessingml/2006/main" xmlns:w14="http://schemas.microsoft.com/office/word/2010/wordml" xmlns:wpg="http://schemas.microsoft.com/office/word/2010/wordprocessingGroup" xmlns:wpi="http://schemas.microsoft.com/office/word/2010/wordprocessingInk" xmlns:wne="http://schemas.microsoft.com/office/word/2006/wordml" xmlns:wps="http://schemas.microsoft.com/office/word/2010/wordprocessingShape" mc:Ignorable="w14 wp14">
   <w:body>
-    <w:p>
-      <w:pPr>
-        <w:pStyle w:val="BodyText"/>
-        <w:rPr>
-          <w:rFonts w:ascii="Times New Roman"/>
-        </w:rPr>
-      </w:pPr>
-      <w:bookmarkStart w:id="0" w:name="_GoBack"/>
-      <w:bookmarkEnd w:id="0"/>
-      <w:r>
-        <w:rPr>
-          <w:noProof/>
-        </w:rPr>
-        <w:drawing>
-          <wp:anchor distT="0" distB="0" distL="114300" distR="114300" simplePos="0" relativeHeight="251659264" behindDoc="0" locked="0" layoutInCell="1" allowOverlap="1">
-            <wp:simplePos x="0" y="0"/>
-            <wp:positionH relativeFrom="column">
-              <wp:posOffset>2266315</wp:posOffset>
-            </wp:positionH>
-            <wp:positionV relativeFrom="paragraph">
-              <wp:posOffset>-97155</wp:posOffset>
-            </wp:positionV>
-            <wp:extent cx="788670" cy="648335"/>
-            <wp:effectExtent l="0" t="0" r="0" b="0"/>
-            <wp:wrapNone/>
-            <wp:docPr id="3" name="Picture 2"/>
-            <wp:cNvGraphicFramePr>
-              <a:graphicFrameLocks xmlns:a="http://schemas.openxmlformats.org/drawingml/2006/main" noChangeAspect="1"/>
-            </wp:cNvGraphicFramePr>
-            <a:graphic xmlns:a="http://schemas.openxmlformats.org/drawingml/2006/main">
-              <a:graphicData uri="http://schemas.openxmlformats.org/drawingml/2006/picture">
-                <pic:pic xmlns:pic="http://schemas.openxmlformats.org/drawingml/2006/picture">
-                  <pic:nvPicPr>
-                    <pic:cNvPr id="0" name="Picture 2"/>
-                    <pic:cNvPicPr>
-                      <a:picLocks noChangeAspect="1" noChangeArrowheads="1"/>
-                    </pic:cNvPicPr>
-                  </pic:nvPicPr>
-                  <pic:blipFill>
-                    <a:blip r:embed="rId8">
-                      <a:extLst>
-                        <a:ext uri="{28A0092B-C50C-407E-A947-70E740481C1C}">
-                          <a14:useLocalDpi xmlns:a14="http://schemas.microsoft.com/office/drawing/2010/main" val="0"/>
-                        </a:ext>
-                      </a:extLst>
-                    </a:blip>
-                    <a:srcRect/>
-                    <a:stretch>
-                      <a:fillRect/>
-                    </a:stretch>
-                  </pic:blipFill>
-                  <pic:spPr bwMode="auto">
-                    <a:xfrm>
-                      <a:off x="0" y="0"/>
-                      <a:ext cx="788670" cy="648335"/>
-                    </a:xfrm>
-                    <a:prstGeom prst="rect">
-                      <a:avLst/>
-                    </a:prstGeom>
-                    <a:noFill/>
-                    <a:ln>
-                      <a:noFill/>
-                    </a:ln>
-                  </pic:spPr>
-                </pic:pic>
-              </a:graphicData>
-            </a:graphic>
-            <wp14:sizeRelH relativeFrom="margin">
-              <wp14:pctWidth>0</wp14:pctWidth>
-            </wp14:sizeRelH>
-            <wp14:sizeRelV relativeFrom="margin">
-              <wp14:pctHeight>0</wp14:pctHeight>
-            </wp14:sizeRelV>
-          </wp:anchor>
-        </w:drawing>
-      </w:r>
-    </w:p>
-    <w:p>
-      <w:pPr>
-        <w:jc w:val="center"/>
-        <w:rPr>
-          <w:rFonts w:ascii="Times New Roman" w:hAnsi="Times New Roman"/>
-          <w:b/>
-          <w:sz w:val="24"/>
-          <w:szCs w:val="24"/>
-          <w:u w:val="single"/>
-        </w:rPr>
-      </w:pPr>
-    </w:p>
-    <w:p>
-      <w:pPr>
-        <w:rPr>
-          <w:rFonts w:ascii="Times New Roman" w:hAnsi="Times New Roman"/>
-          <w:b/>
-          <w:sz w:val="24"/>
-          <w:szCs w:val="24"/>
-          <w:u w:val="single"/>
-        </w:rPr>
-      </w:pPr>
-    </w:p>
-    <w:p>
-      <w:pPr>
-        <w:tabs>
-          <w:tab w:val="left" w:pos="3535"/>
-        </w:tabs>
-        <w:rPr>
-          <w:rFonts w:ascii="Times New Roman" w:hAnsi="Times New Roman"/>
-          <w:b/>
-          <w:sz w:val="24"/>
-          <w:szCs w:val="24"/>
-          <w:u w:val="single"/>
-        </w:rPr>
-      </w:pPr>
-      <w:r>
-        <w:rPr>
-          <w:rFonts w:ascii="Times New Roman" w:hAnsi="Times New Roman"/>
-          <w:b/>
-          <w:sz w:val="24"/>
-          <w:szCs w:val="24"/>
-        </w:rPr>
-        <w:t xml:space="preserve">                                                                </w:t>
-      </w:r>
-      <w:r>
-        <w:rPr>
-          <w:rFonts w:ascii="Times New Roman"/>
-          <w:color w:val="006666"/>
-        </w:rPr>
-        <w:t>INJAAZ</w:t>
-      </w:r>
-    </w:p>
-    <w:p>
-      <w:pPr>
-        <w:rPr>
-          <w:rFonts w:ascii="Times New Roman" w:hAnsi="Times New Roman"/>
-          <w:b/>
-          <w:sz w:val="24"/>
-          <w:szCs w:val="24"/>
-          <w:u w:val="single"/>
-        </w:rPr>
-      </w:pPr>
-    </w:p>
-    <w:p>
-      <w:pPr>
-        <w:rPr>
-          <w:rFonts w:ascii="Times New Roman" w:hAnsi="Times New Roman"/>
-          <w:b/>
-          <w:sz w:val="24"/>
-          <w:szCs w:val="24"/>
-          <w:u w:val="single"/>
-        </w:rPr>
-      </w:pPr>
-    </w:p>
-    <w:p>
-      <w:pPr>
-        <w:jc w:val="center"/>
-        <w:rPr>
-          <w:rFonts w:ascii="Times New Roman" w:hAnsi="Times New Roman"/>
-          <w:b/>
-          <w:sz w:val="24"/>
-          <w:szCs w:val="24"/>
-          <w:u w:val="single"/>
-        </w:rPr>
-      </w:pPr>
-      <w:r>
-        <w:rPr>
-          <w:rFonts w:ascii="Times New Roman" w:hAnsi="Times New Roman"/>
-          <w:b/>
-          <w:sz w:val="24"/>
-          <w:szCs w:val="24"/>
-          <w:u w:val="single"/>
-        </w:rPr>
-        <w:t>Commencement Form</w:t>
-      </w:r>
-      <w:r>
-        <w:rPr>
-          <w:rFonts w:ascii="Times New Roman" w:hAnsi="Times New Roman"/>
-          <w:b/>
-          <w:sz w:val="24"/>
-          <w:szCs w:val="24"/>
-          <w:u w:val="single"/>
-        </w:rPr>
-        <w:t xml:space="preserve">                                              </w:t>
-      </w:r>
-    </w:p>
+    <w:tbl>
+      <w:tblPr>
+        <w:tblW w:type="auto" w:w="0"/>
+        <w:tblLayout w:type="fixed"/>
+        <w:tblLook w:firstColumn="1" w:firstRow="1" w:lastColumn="0" w:lastRow="0" w:noHBand="0" w:noVBand="1" w:val="04A0"/>
+      </w:tblPr>
+      <w:tblGrid>
+        <w:gridCol w:w="4153"/>
+        <w:gridCol w:w="4153"/>
+      </w:tblGrid>
+      <w:tr>
+        <w:tc>
+          <w:tcPr>
+            <w:tcW w:type="dxa" w:w="3685"/>
+          </w:tcPr>
+          <w:p>
+            <w:pPr>
+              <w:keepLines/>
+              <w:jc w:val="left"/>
+            </w:pPr>
+            <w:r/>
+            <w:r>
+              <w:rPr>
+                <w:rFonts w:ascii="Calibri" w:hAnsi="Calibri"/>
+                <w:b/>
+                <w:sz w:val="32"/>
+              </w:rPr>
+              <w:t>Commencement Form</w:t>
+            </w:r>
+          </w:p>
+        </w:tc>
+        <w:tc>
+          <w:tcPr>
+            <w:tcW w:type="dxa" w:w="6236"/>
+          </w:tcPr>
+          <w:p>
+            <w:pPr>
+              <w:jc w:val="right"/>
+            </w:pPr>
+            <w:r>
+              <w:drawing>
+                <wp:inline xmlns:a="http://schemas.openxmlformats.org/drawingml/2006/main" xmlns:pic="http://schemas.openxmlformats.org/drawingml/2006/picture">
+                  <wp:extent cx="648000" cy="609405"/>
+                  <wp:docPr id="1" name="Picture 1"/>
+                  <wp:cNvGraphicFramePr>
+                    <a:graphicFrameLocks noChangeAspect="1"/>
+                  </wp:cNvGraphicFramePr>
+                  <a:graphic>
+                    <a:graphicData uri="http://schemas.openxmlformats.org/drawingml/2006/picture">
+                      <pic:pic>
+                        <pic:nvPicPr>
+                          <pic:cNvPr id="0" name="image.png"/>
+                          <pic:cNvPicPr/>
+                        </pic:nvPicPr>
+                        <pic:blipFill>
+                          <a:blip r:embed="rId12"/>
+                          <a:stretch>
+                            <a:fillRect/>
+                          </a:stretch>
+                        </pic:blipFill>
+                        <pic:spPr>
+                          <a:xfrm>
+                            <a:off x="0" y="0"/>
+                            <a:ext cx="648000" cy="609405"/>
+                          </a:xfrm>
+                          <a:prstGeom prst="rect"/>
+                        </pic:spPr>
+                      </pic:pic>
+                    </a:graphicData>
+                  </a:graphic>
+                </wp:inline>
+              </w:drawing>
+            </w:r>
+          </w:p>
+        </w:tc>
+      </w:tr>
+    </w:tbl>
     <w:p>
       <w:pPr>
         <w:jc w:val="both"/>
@@ -294,7 +187,11 @@
         </w:rPr>
         <w:t xml:space="preserve"> </w:t>
       </w:r>
-    </w:p>
+      <w:r>
+        <w:t xml:space="preserve"> {{ employee_name }}</w:t>
+      </w:r>
+    </w:p>
+    <w:p/>
     <w:p>
       <w:pPr>
         <w:pBdr>
@@ -338,7 +235,11 @@
         </w:rPr>
         <w:t xml:space="preserve">  </w:t>
       </w:r>
-    </w:p>
+      <w:r>
+        <w:t xml:space="preserve"> {{ position }}</w:t>
+      </w:r>
+    </w:p>
+    <w:p/>
     <w:p>
       <w:pPr>
         <w:pBdr>
@@ -381,7 +282,11 @@
         </w:rPr>
         <w:t xml:space="preserve"> </w:t>
       </w:r>
-    </w:p>
+      <w:r>
+        <w:t xml:space="preserve"> {{ contacts }}</w:t>
+      </w:r>
+    </w:p>
+    <w:p/>
     <w:p>
       <w:pPr>
         <w:pBdr>
@@ -413,7 +318,11 @@
         </w:rPr>
         <w:t xml:space="preserve">Department: </w:t>
       </w:r>
-    </w:p>
+      <w:r>
+        <w:t xml:space="preserve"> {{ department }}</w:t>
+      </w:r>
+    </w:p>
+    <w:p/>
     <w:p>
       <w:pPr>
         <w:pBdr>
@@ -445,7 +354,11 @@
         </w:rPr>
         <w:t xml:space="preserve">Organization: </w:t>
       </w:r>
-    </w:p>
+      <w:r>
+        <w:t xml:space="preserve"> {{ organization }}</w:t>
+      </w:r>
+    </w:p>
+    <w:p/>
     <w:p>
       <w:pPr>
         <w:pBdr>
@@ -486,7 +399,11 @@
         </w:rPr>
         <w:t xml:space="preserve"> </w:t>
       </w:r>
-    </w:p>
+      <w:r>
+        <w:t xml:space="preserve"> {{ date_of_joining }}</w:t>
+      </w:r>
+    </w:p>
+    <w:p/>
     <w:p>
       <w:pPr>
         <w:rPr>
@@ -549,7 +466,11 @@
         </w:rPr>
         <w:t xml:space="preserve"> </w:t>
       </w:r>
-    </w:p>
+      <w:r>
+        <w:t xml:space="preserve"> {{ bank_name }}</w:t>
+      </w:r>
+    </w:p>
+    <w:p/>
     <w:p>
       <w:pPr>
         <w:pBdr>
@@ -593,7 +514,11 @@
         </w:rPr>
         <w:t xml:space="preserve"> </w:t>
       </w:r>
-    </w:p>
+      <w:r>
+        <w:t xml:space="preserve"> {{ bank_branch }}</w:t>
+      </w:r>
+    </w:p>
+    <w:p/>
     <w:p>
       <w:pPr>
         <w:pBdr>
@@ -718,7 +643,11 @@
         </w:rPr>
         <w:tab/>
       </w:r>
-    </w:p>
+      <w:r>
+        <w:t xml:space="preserve"> {{ account_number }}</w:t>
+      </w:r>
+    </w:p>
+    <w:p/>
     <w:p>
       <w:pPr>
         <w:pBdr>
@@ -728,6 +657,9 @@
           <w:right w:val="single" w:sz="4" w:space="4" w:color="auto"/>
           <w:between w:val="single" w:sz="4" w:space="1" w:color="auto"/>
         </w:pBdr>
+        <w:tabs>
+          <w:tab w:pos="4680" w:val="center"/>
+        </w:tabs>
         <w:rPr>
           <w:rFonts w:ascii="Times New Roman" w:hAnsi="Times New Roman"/>
           <w:b/>
@@ -737,131 +669,17 @@
         </w:rPr>
       </w:pPr>
       <w:r>
-        <w:rPr>
-          <w:rFonts w:ascii="Times New Roman" w:hAnsi="Times New Roman"/>
-          <w:b/>
-          <w:sz w:val="24"/>
-          <w:szCs w:val="24"/>
-        </w:rPr>
-        <w:t xml:space="preserve"> </w:t>
-      </w:r>
-      <w:r>
-        <w:rPr>
-          <w:rFonts w:ascii="Times New Roman" w:hAnsi="Times New Roman"/>
-          <w:b/>
-          <w:sz w:val="24"/>
-          <w:szCs w:val="24"/>
-        </w:rPr>
-        <w:t>Employee’s Signature:</w:t>
-      </w:r>
-      <w:r>
-        <w:rPr>
-          <w:rFonts w:ascii="Times New Roman" w:hAnsi="Times New Roman"/>
-          <w:b/>
-          <w:sz w:val="24"/>
-          <w:szCs w:val="24"/>
-        </w:rPr>
+        <w:t>Employee's Signature:</w:t>
+      </w:r>
+      <w:r>
         <w:tab/>
       </w:r>
       <w:r>
-        <w:rPr>
-          <w:rFonts w:ascii="Times New Roman" w:hAnsi="Times New Roman"/>
-          <w:b/>
-          <w:sz w:val="24"/>
-          <w:szCs w:val="24"/>
-        </w:rPr>
-        <w:tab/>
-      </w:r>
-      <w:r>
-        <w:rPr>
-          <w:rFonts w:ascii="Times New Roman" w:hAnsi="Times New Roman"/>
-          <w:b/>
-          <w:color w:val="D9D9D9"/>
-          <w:sz w:val="24"/>
-          <w:szCs w:val="24"/>
-        </w:rPr>
-        <w:t xml:space="preserve">Sign </w:t>
-      </w:r>
-      <w:r>
-        <w:rPr>
-          <w:rFonts w:ascii="Times New Roman" w:hAnsi="Times New Roman"/>
-          <w:b/>
-          <w:color w:val="D9D9D9"/>
-          <w:sz w:val="24"/>
-          <w:szCs w:val="24"/>
-        </w:rPr>
-        <w:tab/>
-      </w:r>
-      <w:r>
-        <w:rPr>
-          <w:rFonts w:ascii="Times New Roman" w:hAnsi="Times New Roman"/>
-          <w:b/>
-          <w:color w:val="000000"/>
-          <w:sz w:val="24"/>
-          <w:szCs w:val="24"/>
-        </w:rPr>
-        <w:tab/>
-      </w:r>
-      <w:r>
-        <w:rPr>
-          <w:rFonts w:ascii="Times New Roman" w:hAnsi="Times New Roman"/>
-          <w:b/>
-          <w:color w:val="000000"/>
-          <w:sz w:val="24"/>
-          <w:szCs w:val="24"/>
-        </w:rPr>
-        <w:tab/>
-      </w:r>
-      <w:r>
-        <w:rPr>
-          <w:rFonts w:ascii="Times New Roman" w:hAnsi="Times New Roman"/>
-          <w:b/>
-          <w:color w:val="000000"/>
-          <w:sz w:val="24"/>
-          <w:szCs w:val="24"/>
-        </w:rPr>
-        <w:tab/>
-        <w:t>Date</w:t>
-      </w:r>
-      <w:r>
-        <w:rPr>
-          <w:rFonts w:ascii="Times New Roman" w:hAnsi="Times New Roman"/>
-          <w:b/>
-          <w:color w:val="000000"/>
-          <w:sz w:val="24"/>
-          <w:szCs w:val="24"/>
-        </w:rPr>
-        <w:t xml:space="preserve">: </w:t>
-      </w:r>
-      <w:r>
-        <w:rPr>
-          <w:rFonts w:ascii="Times New Roman" w:hAnsi="Times New Roman"/>
-          <w:b/>
-          <w:color w:val="000000"/>
-          <w:sz w:val="24"/>
-          <w:szCs w:val="24"/>
-        </w:rPr>
-        <w:tab/>
-      </w:r>
-      <w:r>
-        <w:rPr>
-          <w:rFonts w:ascii="Times New Roman" w:hAnsi="Times New Roman"/>
-          <w:b/>
-          <w:sz w:val="24"/>
-          <w:szCs w:val="24"/>
-        </w:rPr>
-        <w:tab/>
-      </w:r>
-      <w:r>
-        <w:rPr>
-          <w:rFonts w:ascii="Times New Roman" w:hAnsi="Times New Roman"/>
-          <w:b/>
-          <w:sz w:val="24"/>
-          <w:szCs w:val="24"/>
-        </w:rPr>
-        <w:tab/>
-      </w:r>
-    </w:p>
+        <w:t>{{ employee_signature }}    Date: {{ employee_sign_date }}</w:t>
+      </w:r>
+    </w:p>
+    <w:p/>
+    <w:p/>
     <w:p>
       <w:pPr>
         <w:rPr>
@@ -924,7 +742,11 @@
         </w:rPr>
         <w:t>Name:</w:t>
       </w:r>
-    </w:p>
+      <w:r>
+        <w:t xml:space="preserve"> {{ reporting_to_name }}</w:t>
+      </w:r>
+    </w:p>
+    <w:p/>
     <w:p>
       <w:pPr>
         <w:pBdr>
@@ -968,7 +790,11 @@
         </w:rPr>
         <w:t>:</w:t>
       </w:r>
-    </w:p>
+      <w:r>
+        <w:t xml:space="preserve"> {{ reporting_to_designation }}</w:t>
+      </w:r>
+    </w:p>
+    <w:p/>
     <w:p>
       <w:pPr>
         <w:pBdr>
@@ -1003,7 +829,11 @@
         </w:rPr>
         <w:tab/>
       </w:r>
-    </w:p>
+      <w:r>
+        <w:t xml:space="preserve"> {{ reporting_to_contact }}</w:t>
+      </w:r>
+    </w:p>
+    <w:p/>
     <w:p>
       <w:pPr>
         <w:pBdr>
@@ -1013,241 +843,28 @@
           <w:right w:val="single" w:sz="4" w:space="4" w:color="auto"/>
           <w:between w:val="single" w:sz="4" w:space="1" w:color="auto"/>
         </w:pBdr>
-        <w:rPr>
-          <w:rFonts w:ascii="Times New Roman" w:hAnsi="Times New Roman"/>
-          <w:b/>
-          <w:sz w:val="24"/>
-          <w:szCs w:val="24"/>
-        </w:rPr>
-      </w:pPr>
-      <w:r>
-        <w:rPr>
-          <w:rFonts w:ascii="Times New Roman" w:hAnsi="Times New Roman"/>
-          <w:b/>
-          <w:sz w:val="24"/>
-          <w:szCs w:val="24"/>
-        </w:rPr>
-        <w:t xml:space="preserve"> </w:t>
-      </w:r>
-      <w:r>
-        <w:rPr>
-          <w:rFonts w:ascii="Times New Roman" w:hAnsi="Times New Roman"/>
-          <w:b/>
-          <w:sz w:val="24"/>
-          <w:szCs w:val="24"/>
-        </w:rPr>
+        <w:tabs>
+          <w:tab w:pos="4680" w:val="center"/>
+        </w:tabs>
+        <w:rPr>
+          <w:rFonts w:ascii="Times New Roman" w:hAnsi="Times New Roman"/>
+          <w:b/>
+          <w:sz w:val="24"/>
+          <w:szCs w:val="24"/>
+        </w:rPr>
+      </w:pPr>
+      <w:r>
         <w:t>Signature:</w:t>
       </w:r>
       <w:r>
-        <w:rPr>
-          <w:rFonts w:ascii="Times New Roman" w:hAnsi="Times New Roman"/>
-          <w:b/>
-          <w:sz w:val="24"/>
-          <w:szCs w:val="24"/>
-        </w:rPr>
         <w:tab/>
       </w:r>
       <w:r>
-        <w:rPr>
-          <w:rFonts w:ascii="Times New Roman" w:hAnsi="Times New Roman"/>
-          <w:b/>
-          <w:sz w:val="24"/>
-          <w:szCs w:val="24"/>
-        </w:rPr>
-        <w:tab/>
-      </w:r>
-      <w:r>
-        <w:rPr>
-          <w:rFonts w:ascii="Times New Roman" w:hAnsi="Times New Roman"/>
-          <w:b/>
-          <w:sz w:val="24"/>
-          <w:szCs w:val="24"/>
-        </w:rPr>
-        <w:tab/>
-      </w:r>
-      <w:r>
-        <w:rPr>
-          <w:rFonts w:ascii="Times New Roman" w:hAnsi="Times New Roman"/>
-          <w:b/>
-          <w:sz w:val="24"/>
-          <w:szCs w:val="24"/>
-        </w:rPr>
-        <w:tab/>
-      </w:r>
-      <w:r>
-        <w:rPr>
-          <w:rFonts w:ascii="Times New Roman" w:hAnsi="Times New Roman"/>
-          <w:b/>
-          <w:color w:val="D9D9D9"/>
-          <w:sz w:val="24"/>
-          <w:szCs w:val="24"/>
-        </w:rPr>
-        <w:t>Sign</w:t>
-      </w:r>
-      <w:r>
-        <w:rPr>
-          <w:rFonts w:ascii="Times New Roman" w:hAnsi="Times New Roman"/>
-          <w:b/>
-          <w:sz w:val="24"/>
-          <w:szCs w:val="24"/>
-        </w:rPr>
-        <w:tab/>
-      </w:r>
-      <w:r>
-        <w:rPr>
-          <w:rFonts w:ascii="Times New Roman" w:hAnsi="Times New Roman"/>
-          <w:b/>
-          <w:sz w:val="24"/>
-          <w:szCs w:val="24"/>
-        </w:rPr>
-        <w:tab/>
-      </w:r>
-      <w:r>
-        <w:rPr>
-          <w:rFonts w:ascii="Times New Roman" w:hAnsi="Times New Roman"/>
-          <w:b/>
-          <w:sz w:val="24"/>
-          <w:szCs w:val="24"/>
-        </w:rPr>
-        <w:tab/>
-      </w:r>
-      <w:r>
-        <w:rPr>
-          <w:rFonts w:ascii="Times New Roman" w:hAnsi="Times New Roman"/>
-          <w:b/>
-          <w:sz w:val="24"/>
-          <w:szCs w:val="24"/>
-        </w:rPr>
-        <w:tab/>
-      </w:r>
-      <w:r>
-        <w:rPr>
-          <w:rFonts w:ascii="Times New Roman" w:hAnsi="Times New Roman"/>
-          <w:b/>
-          <w:color w:val="000000"/>
-          <w:sz w:val="24"/>
-          <w:szCs w:val="24"/>
-        </w:rPr>
-        <w:t>Date:</w:t>
-      </w:r>
-      <w:r>
-        <w:rPr>
-          <w:rFonts w:ascii="Times New Roman" w:hAnsi="Times New Roman"/>
-          <w:b/>
-          <w:sz w:val="24"/>
-          <w:szCs w:val="24"/>
-        </w:rPr>
-        <w:tab/>
-      </w:r>
-      <w:r>
-        <w:rPr>
-          <w:rFonts w:ascii="Times New Roman" w:hAnsi="Times New Roman"/>
-          <w:b/>
-          <w:sz w:val="24"/>
-          <w:szCs w:val="24"/>
-        </w:rPr>
-        <w:tab/>
-      </w:r>
-      <w:r>
-        <w:rPr>
-          <w:rFonts w:ascii="Times New Roman" w:hAnsi="Times New Roman"/>
-          <w:b/>
-          <w:sz w:val="24"/>
-          <w:szCs w:val="24"/>
-        </w:rPr>
-        <w:tab/>
-      </w:r>
-      <w:r>
-        <w:rPr>
-          <w:rFonts w:ascii="Times New Roman" w:hAnsi="Times New Roman"/>
-          <w:b/>
-          <w:sz w:val="24"/>
-          <w:szCs w:val="24"/>
-        </w:rPr>
-        <w:tab/>
-      </w:r>
-      <w:r>
-        <w:rPr>
-          <w:rFonts w:ascii="Times New Roman" w:hAnsi="Times New Roman"/>
-          <w:b/>
-          <w:sz w:val="24"/>
-          <w:szCs w:val="24"/>
-        </w:rPr>
-        <w:tab/>
-      </w:r>
-      <w:r>
-        <w:rPr>
-          <w:rFonts w:ascii="Times New Roman" w:hAnsi="Times New Roman"/>
-          <w:b/>
-          <w:sz w:val="24"/>
-          <w:szCs w:val="24"/>
-        </w:rPr>
-        <w:tab/>
-      </w:r>
-      <w:r>
-        <w:rPr>
-          <w:rFonts w:ascii="Times New Roman" w:hAnsi="Times New Roman"/>
-          <w:b/>
-          <w:sz w:val="24"/>
-          <w:szCs w:val="24"/>
-        </w:rPr>
-        <w:tab/>
-      </w:r>
-      <w:r>
-        <w:rPr>
-          <w:rFonts w:ascii="Times New Roman" w:hAnsi="Times New Roman"/>
-          <w:b/>
-          <w:sz w:val="24"/>
-          <w:szCs w:val="24"/>
-        </w:rPr>
-        <w:tab/>
-      </w:r>
-      <w:r>
-        <w:rPr>
-          <w:rFonts w:ascii="Times New Roman" w:hAnsi="Times New Roman"/>
-          <w:b/>
-          <w:sz w:val="24"/>
-          <w:szCs w:val="24"/>
-        </w:rPr>
-        <w:tab/>
-      </w:r>
-      <w:r>
-        <w:rPr>
-          <w:rFonts w:ascii="Times New Roman" w:hAnsi="Times New Roman"/>
-          <w:b/>
-          <w:sz w:val="24"/>
-          <w:szCs w:val="24"/>
-        </w:rPr>
-        <w:tab/>
-      </w:r>
-      <w:r>
-        <w:rPr>
-          <w:rFonts w:ascii="Times New Roman" w:hAnsi="Times New Roman"/>
-          <w:b/>
-          <w:sz w:val="24"/>
-          <w:szCs w:val="24"/>
-        </w:rPr>
-        <w:tab/>
-      </w:r>
-      <w:r>
-        <w:rPr>
-          <w:rFonts w:ascii="Times New Roman" w:hAnsi="Times New Roman"/>
-          <w:b/>
-          <w:sz w:val="24"/>
-          <w:szCs w:val="24"/>
-        </w:rPr>
-        <w:tab/>
-      </w:r>
-      <w:r>
-        <w:rPr>
-          <w:rFonts w:ascii="Times New Roman" w:hAnsi="Times New Roman"/>
-          <w:b/>
-          <w:sz w:val="24"/>
-          <w:szCs w:val="24"/>
-        </w:rPr>
-        <w:tab/>
-      </w:r>
-    </w:p>
+        <w:t>{{ reporting_to_signature }}    Date: {{ reporting_sign_date }}</w:t>
+      </w:r>
+    </w:p>
+    <w:p/>
+    <w:p/>
     <w:p>
       <w:pPr>
         <w:jc w:val="both"/>

</xml_diff>

<commit_message>
Update Commencement Form documents and script for improved clarity and formatting. Added introductory text to the Commencement Form and its template. Enhanced the header generation script to include dynamic intro text and adjusted table formatting for better layout. Updated database file with new changes.
</commit_message>
<xml_diff>
--- a/HR Documents/Commencement Form - INJAAZ.DOCX
+++ b/HR Documents/Commencement Form - INJAAZ.DOCX
@@ -13,13 +13,21 @@
         <w:gridCol w:w="4153"/>
       </w:tblGrid>
       <w:tr>
+        <w:trPr>
+          <w:trHeight w:val="240" w:hRule="atLeast"/>
+        </w:trPr>
         <w:tc>
           <w:tcPr>
-            <w:tcW w:type="dxa" w:w="3685"/>
+            <w:tcW w:type="dxa" w:w="7654"/>
+            <w:tcMar>
+              <w:top w:w="60" w:type="dxa"/>
+              <w:bottom w:w="0" w:type="dxa"/>
+            </w:tcMar>
           </w:tcPr>
           <w:p>
             <w:pPr>
               <w:keepLines/>
+              <w:spacing w:after="0"/>
               <w:jc w:val="left"/>
             </w:pPr>
             <w:r/>
@@ -27,18 +35,36 @@
               <w:rPr>
                 <w:rFonts w:ascii="Calibri" w:hAnsi="Calibri"/>
                 <w:b/>
-                <w:sz w:val="32"/>
+                <w:sz w:val="28"/>
               </w:rPr>
               <w:t>Commencement Form</w:t>
+            </w:r>
+          </w:p>
+          <w:p>
+            <w:pPr>
+              <w:spacing w:before="0" w:after="240"/>
+              <w:jc w:val="left"/>
+            </w:pPr>
+            <w:r>
+              <w:rPr>
+                <w:rFonts w:ascii="Calibri" w:hAnsi="Calibri"/>
+                <w:sz w:val="22"/>
+              </w:rPr>
+              <w:t>To complete the administrative aspect of your Employment please complete this form within 5 days of joining and fax it back to AH or email it to joana@ajmanholding.ae</w:t>
             </w:r>
           </w:p>
         </w:tc>
         <w:tc>
           <w:tcPr>
-            <w:tcW w:type="dxa" w:w="6236"/>
+            <w:tcW w:type="dxa" w:w="1984"/>
+            <w:tcMar>
+              <w:top w:w="60" w:type="dxa"/>
+              <w:bottom w:w="0" w:type="dxa"/>
+            </w:tcMar>
           </w:tcPr>
           <w:p>
             <w:pPr>
+              <w:spacing w:after="0"/>
               <w:jc w:val="right"/>
             </w:pPr>
             <w:r>
@@ -81,6 +107,7 @@
     </w:tbl>
     <w:p>
       <w:pPr>
+        <w:spacing w:before="0" w:after="0" w:line="240" w:lineRule="auto"/>
         <w:jc w:val="both"/>
         <w:rPr>
           <w:rFonts w:ascii="Times New Roman" w:hAnsi="Times New Roman"/>
@@ -93,6 +120,7 @@
     </w:p>
     <w:p>
       <w:pPr>
+        <w:spacing w:before="0" w:after="0" w:line="240" w:lineRule="auto"/>
         <w:jc w:val="both"/>
         <w:rPr>
           <w:rFonts w:ascii="Times New Roman" w:hAnsi="Times New Roman"/>
@@ -125,6 +153,7 @@
     </w:p>
     <w:p>
       <w:pPr>
+        <w:spacing w:before="0" w:after="0" w:line="240" w:lineRule="auto"/>
         <w:jc w:val="both"/>
         <w:rPr>
           <w:rFonts w:ascii="Times New Roman" w:hAnsi="Times New Roman"/>
@@ -152,6 +181,7 @@
           <w:right w:val="single" w:sz="4" w:space="4" w:color="auto"/>
           <w:between w:val="single" w:sz="4" w:space="1" w:color="auto"/>
         </w:pBdr>
+        <w:spacing w:before="0" w:after="0" w:line="240" w:lineRule="auto"/>
         <w:rPr>
           <w:rFonts w:ascii="Tahoma" w:hAnsi="Tahoma" w:cs="Tahoma"/>
           <w:b/>
@@ -191,7 +221,11 @@
         <w:t xml:space="preserve"> {{ employee_name }}</w:t>
       </w:r>
     </w:p>
-    <w:p/>
+    <w:p>
+      <w:pPr>
+        <w:spacing w:before="0" w:after="0" w:line="240" w:lineRule="auto"/>
+      </w:pPr>
+    </w:p>
     <w:p>
       <w:pPr>
         <w:pBdr>

</xml_diff>

<commit_message>
Update HR documents and database with improved formatting and clarity. Refactored various forms including Duty Resumption, Employee Contract Renewal, Grievance, Performance Evaluation, and others to enhance readability and usability. Updated injaaz.db to reflect these changes.
</commit_message>
<xml_diff>
--- a/HR Documents/Commencement Form - INJAAZ.DOCX
+++ b/HR Documents/Commencement Form - INJAAZ.DOCX
@@ -35,7 +35,7 @@
               <w:rPr>
                 <w:rFonts w:ascii="Calibri" w:hAnsi="Calibri"/>
                 <w:b/>
-                <w:sz w:val="28"/>
+                <w:sz w:val="40"/>
               </w:rPr>
               <w:t>Commencement Form</w:t>
             </w:r>
@@ -48,7 +48,7 @@
             <w:r>
               <w:rPr>
                 <w:rFonts w:ascii="Calibri" w:hAnsi="Calibri"/>
-                <w:sz w:val="22"/>
+                <w:sz w:val="18"/>
               </w:rPr>
               <w:t>To complete the administrative aspect of your Employment please complete this form within 5 days of joining and fax it back to AH or email it to joana@ajmanholding.ae</w:t>
             </w:r>

</xml_diff>

<commit_message>
Update HR document templates and database for improved formatting and dynamic content integration. Enhanced various forms including Commencement, Duty Resumption, Employee Contract Renewal, and Leave Application with consistent styling and layout adjustments. Updated injaaz.db to reflect changes in document structure and content mapping for better usability.
</commit_message>
<xml_diff>
--- a/HR Documents/Commencement Form - INJAAZ.DOCX
+++ b/HR Documents/Commencement Form - INJAAZ.DOCX
@@ -2,112 +2,192 @@
 <file path=word/document.xml><?xml version="1.0" encoding="utf-8"?>
 <w:document xmlns:wpc="http://schemas.microsoft.com/office/word/2010/wordprocessingCanvas" xmlns:mc="http://schemas.openxmlformats.org/markup-compatibility/2006" xmlns:o="urn:schemas-microsoft-com:office:office" xmlns:r="http://schemas.openxmlformats.org/officeDocument/2006/relationships" xmlns:m="http://schemas.openxmlformats.org/officeDocument/2006/math" xmlns:v="urn:schemas-microsoft-com:vml" xmlns:wp14="http://schemas.microsoft.com/office/word/2010/wordprocessingDrawing" xmlns:wp="http://schemas.openxmlformats.org/drawingml/2006/wordprocessingDrawing" xmlns:w10="urn:schemas-microsoft-com:office:word" xmlns:w="http://schemas.openxmlformats.org/wordprocessingml/2006/main" xmlns:w14="http://schemas.microsoft.com/office/word/2010/wordml" xmlns:wpg="http://schemas.microsoft.com/office/word/2010/wordprocessingGroup" xmlns:wpi="http://schemas.microsoft.com/office/word/2010/wordprocessingInk" xmlns:wne="http://schemas.microsoft.com/office/word/2006/wordml" xmlns:wps="http://schemas.microsoft.com/office/word/2010/wordprocessingShape" mc:Ignorable="w14 wp14">
   <w:body>
-    <w:tbl>
-      <w:tblPr>
-        <w:tblW w:type="auto" w:w="0"/>
-        <w:tblLayout w:type="fixed"/>
-        <w:tblLook w:firstColumn="1" w:firstRow="1" w:lastColumn="0" w:lastRow="0" w:noHBand="0" w:noVBand="1" w:val="04A0"/>
-      </w:tblPr>
-      <w:tblGrid>
-        <w:gridCol w:w="4153"/>
-        <w:gridCol w:w="4153"/>
-      </w:tblGrid>
-      <w:tr>
-        <w:trPr>
-          <w:trHeight w:val="240" w:hRule="atLeast"/>
-        </w:trPr>
-        <w:tc>
-          <w:tcPr>
-            <w:tcW w:type="dxa" w:w="7654"/>
-            <w:tcMar>
-              <w:top w:w="60" w:type="dxa"/>
-              <w:bottom w:w="0" w:type="dxa"/>
-            </w:tcMar>
-          </w:tcPr>
-          <w:p>
-            <w:pPr>
-              <w:keepLines/>
-              <w:spacing w:after="0"/>
-              <w:jc w:val="left"/>
-            </w:pPr>
-            <w:r/>
-            <w:r>
-              <w:rPr>
-                <w:rFonts w:ascii="Calibri" w:hAnsi="Calibri"/>
-                <w:b/>
-                <w:sz w:val="40"/>
-              </w:rPr>
-              <w:t>Commencement Form</w:t>
-            </w:r>
-          </w:p>
-          <w:p>
-            <w:pPr>
-              <w:spacing w:before="0" w:after="240"/>
-              <w:jc w:val="left"/>
-            </w:pPr>
-            <w:r>
-              <w:rPr>
-                <w:rFonts w:ascii="Calibri" w:hAnsi="Calibri"/>
-                <w:sz w:val="18"/>
-              </w:rPr>
-              <w:t>To complete the administrative aspect of your Employment please complete this form within 5 days of joining and fax it back to AH or email it to joana@ajmanholding.ae</w:t>
-            </w:r>
-          </w:p>
-        </w:tc>
-        <w:tc>
-          <w:tcPr>
-            <w:tcW w:type="dxa" w:w="1984"/>
-            <w:tcMar>
-              <w:top w:w="60" w:type="dxa"/>
-              <w:bottom w:w="0" w:type="dxa"/>
-            </w:tcMar>
-          </w:tcPr>
-          <w:p>
-            <w:pPr>
-              <w:spacing w:after="0"/>
-              <w:jc w:val="right"/>
-            </w:pPr>
-            <w:r>
-              <w:drawing>
-                <wp:inline xmlns:a="http://schemas.openxmlformats.org/drawingml/2006/main" xmlns:pic="http://schemas.openxmlformats.org/drawingml/2006/picture">
-                  <wp:extent cx="648000" cy="609405"/>
-                  <wp:docPr id="1" name="Picture 1"/>
-                  <wp:cNvGraphicFramePr>
-                    <a:graphicFrameLocks noChangeAspect="1"/>
-                  </wp:cNvGraphicFramePr>
-                  <a:graphic>
-                    <a:graphicData uri="http://schemas.openxmlformats.org/drawingml/2006/picture">
-                      <pic:pic>
-                        <pic:nvPicPr>
-                          <pic:cNvPr id="0" name="image.png"/>
-                          <pic:cNvPicPr/>
-                        </pic:nvPicPr>
-                        <pic:blipFill>
-                          <a:blip r:embed="rId12"/>
-                          <a:stretch>
-                            <a:fillRect/>
-                          </a:stretch>
-                        </pic:blipFill>
-                        <pic:spPr>
-                          <a:xfrm>
-                            <a:off x="0" y="0"/>
-                            <a:ext cx="648000" cy="609405"/>
-                          </a:xfrm>
-                          <a:prstGeom prst="rect"/>
-                        </pic:spPr>
-                      </pic:pic>
-                    </a:graphicData>
-                  </a:graphic>
-                </wp:inline>
-              </w:drawing>
-            </w:r>
-          </w:p>
-        </w:tc>
-      </w:tr>
-    </w:tbl>
-    <w:p>
-      <w:pPr>
-        <w:spacing w:before="0" w:after="0" w:line="240" w:lineRule="auto"/>
+    <w:p>
+      <w:pPr>
+        <w:pStyle w:val="BodyText"/>
+        <w:rPr>
+          <w:rFonts w:ascii="Times New Roman"/>
+        </w:rPr>
+      </w:pPr>
+      <w:bookmarkStart w:id="0" w:name="_GoBack"/>
+      <w:bookmarkEnd w:id="0"/>
+      <w:r>
+        <w:rPr>
+          <w:noProof/>
+        </w:rPr>
+        <w:drawing>
+          <wp:anchor distT="0" distB="0" distL="114300" distR="114300" simplePos="0" relativeHeight="251659264" behindDoc="0" locked="0" layoutInCell="1" allowOverlap="1">
+            <wp:simplePos x="0" y="0"/>
+            <wp:positionH relativeFrom="column">
+              <wp:posOffset>2266315</wp:posOffset>
+            </wp:positionH>
+            <wp:positionV relativeFrom="paragraph">
+              <wp:posOffset>-97155</wp:posOffset>
+            </wp:positionV>
+            <wp:extent cx="788670" cy="648335"/>
+            <wp:effectExtent l="0" t="0" r="0" b="0"/>
+            <wp:wrapNone/>
+            <wp:docPr id="3" name="Picture 2"/>
+            <wp:cNvGraphicFramePr>
+              <a:graphicFrameLocks xmlns:a="http://schemas.openxmlformats.org/drawingml/2006/main" noChangeAspect="1"/>
+            </wp:cNvGraphicFramePr>
+            <a:graphic xmlns:a="http://schemas.openxmlformats.org/drawingml/2006/main">
+              <a:graphicData uri="http://schemas.openxmlformats.org/drawingml/2006/picture">
+                <pic:pic xmlns:pic="http://schemas.openxmlformats.org/drawingml/2006/picture">
+                  <pic:nvPicPr>
+                    <pic:cNvPr id="0" name="Picture 2"/>
+                    <pic:cNvPicPr>
+                      <a:picLocks noChangeAspect="1" noChangeArrowheads="1"/>
+                    </pic:cNvPicPr>
+                  </pic:nvPicPr>
+                  <pic:blipFill>
+                    <a:blip r:embed="rId8">
+                      <a:extLst>
+                        <a:ext uri="{28A0092B-C50C-407E-A947-70E740481C1C}">
+                          <a14:useLocalDpi xmlns:a14="http://schemas.microsoft.com/office/drawing/2010/main" val="0"/>
+                        </a:ext>
+                      </a:extLst>
+                    </a:blip>
+                    <a:srcRect/>
+                    <a:stretch>
+                      <a:fillRect/>
+                    </a:stretch>
+                  </pic:blipFill>
+                  <pic:spPr bwMode="auto">
+                    <a:xfrm>
+                      <a:off x="0" y="0"/>
+                      <a:ext cx="788670" cy="648335"/>
+                    </a:xfrm>
+                    <a:prstGeom prst="rect">
+                      <a:avLst/>
+                    </a:prstGeom>
+                    <a:noFill/>
+                    <a:ln>
+                      <a:noFill/>
+                    </a:ln>
+                  </pic:spPr>
+                </pic:pic>
+              </a:graphicData>
+            </a:graphic>
+            <wp14:sizeRelH relativeFrom="margin">
+              <wp14:pctWidth>0</wp14:pctWidth>
+            </wp14:sizeRelH>
+            <wp14:sizeRelV relativeFrom="margin">
+              <wp14:pctHeight>0</wp14:pctHeight>
+            </wp14:sizeRelV>
+          </wp:anchor>
+        </w:drawing>
+      </w:r>
+    </w:p>
+    <w:p>
+      <w:pPr>
+        <w:jc w:val="center"/>
+        <w:rPr>
+          <w:rFonts w:ascii="Times New Roman" w:hAnsi="Times New Roman"/>
+          <w:b/>
+          <w:sz w:val="24"/>
+          <w:szCs w:val="24"/>
+          <w:u w:val="single"/>
+        </w:rPr>
+      </w:pPr>
+    </w:p>
+    <w:p>
+      <w:pPr>
+        <w:rPr>
+          <w:rFonts w:ascii="Times New Roman" w:hAnsi="Times New Roman"/>
+          <w:b/>
+          <w:sz w:val="24"/>
+          <w:szCs w:val="24"/>
+          <w:u w:val="single"/>
+        </w:rPr>
+      </w:pPr>
+    </w:p>
+    <w:p>
+      <w:pPr>
+        <w:tabs>
+          <w:tab w:val="left" w:pos="3535"/>
+        </w:tabs>
+        <w:rPr>
+          <w:rFonts w:ascii="Times New Roman" w:hAnsi="Times New Roman"/>
+          <w:b/>
+          <w:sz w:val="24"/>
+          <w:szCs w:val="24"/>
+          <w:u w:val="single"/>
+        </w:rPr>
+      </w:pPr>
+      <w:r>
+        <w:rPr>
+          <w:rFonts w:ascii="Times New Roman" w:hAnsi="Times New Roman"/>
+          <w:b/>
+          <w:sz w:val="24"/>
+          <w:szCs w:val="24"/>
+        </w:rPr>
+        <w:t xml:space="preserve">                                                                </w:t>
+      </w:r>
+      <w:r>
+        <w:rPr>
+          <w:rFonts w:ascii="Times New Roman"/>
+          <w:color w:val="006666"/>
+        </w:rPr>
+        <w:t>INJAAZ</w:t>
+      </w:r>
+    </w:p>
+    <w:p>
+      <w:pPr>
+        <w:rPr>
+          <w:rFonts w:ascii="Times New Roman" w:hAnsi="Times New Roman"/>
+          <w:b/>
+          <w:sz w:val="24"/>
+          <w:szCs w:val="24"/>
+          <w:u w:val="single"/>
+        </w:rPr>
+      </w:pPr>
+    </w:p>
+    <w:p>
+      <w:pPr>
+        <w:rPr>
+          <w:rFonts w:ascii="Times New Roman" w:hAnsi="Times New Roman"/>
+          <w:b/>
+          <w:sz w:val="24"/>
+          <w:szCs w:val="24"/>
+          <w:u w:val="single"/>
+        </w:rPr>
+      </w:pPr>
+    </w:p>
+    <w:p>
+      <w:pPr>
+        <w:jc w:val="center"/>
+        <w:rPr>
+          <w:rFonts w:ascii="Times New Roman" w:hAnsi="Times New Roman"/>
+          <w:b/>
+          <w:sz w:val="24"/>
+          <w:szCs w:val="24"/>
+          <w:u w:val="single"/>
+        </w:rPr>
+      </w:pPr>
+      <w:r>
+        <w:rPr>
+          <w:rFonts w:ascii="Times New Roman" w:hAnsi="Times New Roman"/>
+          <w:b/>
+          <w:sz w:val="24"/>
+          <w:szCs w:val="24"/>
+          <w:u w:val="single"/>
+        </w:rPr>
+        <w:t>Commencement Form</w:t>
+      </w:r>
+      <w:r>
+        <w:rPr>
+          <w:rFonts w:ascii="Times New Roman" w:hAnsi="Times New Roman"/>
+          <w:b/>
+          <w:sz w:val="24"/>
+          <w:szCs w:val="24"/>
+          <w:u w:val="single"/>
+        </w:rPr>
+        <w:t xml:space="preserve">                                              </w:t>
+      </w:r>
+    </w:p>
+    <w:p>
+      <w:pPr>
         <w:jc w:val="both"/>
         <w:rPr>
           <w:rFonts w:ascii="Times New Roman" w:hAnsi="Times New Roman"/>
@@ -120,7 +200,6 @@
     </w:p>
     <w:p>
       <w:pPr>
-        <w:spacing w:before="0" w:after="0" w:line="240" w:lineRule="auto"/>
         <w:jc w:val="both"/>
         <w:rPr>
           <w:rFonts w:ascii="Times New Roman" w:hAnsi="Times New Roman"/>
@@ -153,7 +232,6 @@
     </w:p>
     <w:p>
       <w:pPr>
-        <w:spacing w:before="0" w:after="0" w:line="240" w:lineRule="auto"/>
         <w:jc w:val="both"/>
         <w:rPr>
           <w:rFonts w:ascii="Times New Roman" w:hAnsi="Times New Roman"/>
@@ -181,7 +259,6 @@
           <w:right w:val="single" w:sz="4" w:space="4" w:color="auto"/>
           <w:between w:val="single" w:sz="4" w:space="1" w:color="auto"/>
         </w:pBdr>
-        <w:spacing w:before="0" w:after="0" w:line="240" w:lineRule="auto"/>
         <w:rPr>
           <w:rFonts w:ascii="Tahoma" w:hAnsi="Tahoma" w:cs="Tahoma"/>
           <w:b/>
@@ -217,14 +294,11 @@
         </w:rPr>
         <w:t xml:space="preserve"> </w:t>
       </w:r>
-      <w:r>
-        <w:t xml:space="preserve"> {{ employee_name }}</w:t>
-      </w:r>
-    </w:p>
-    <w:p>
-      <w:pPr>
-        <w:spacing w:before="0" w:after="0" w:line="240" w:lineRule="auto"/>
-      </w:pPr>
+    </w:p>
+    <w:p>
+      <w:r>
+        <w:t>{{ employee_name }}</w:t>
+      </w:r>
     </w:p>
     <w:p>
       <w:pPr>
@@ -269,11 +343,12 @@
         </w:rPr>
         <w:t xml:space="preserve">  </w:t>
       </w:r>
-      <w:r>
-        <w:t xml:space="preserve"> {{ position }}</w:t>
-      </w:r>
-    </w:p>
-    <w:p/>
+    </w:p>
+    <w:p>
+      <w:r>
+        <w:t>{{ position }}</w:t>
+      </w:r>
+    </w:p>
     <w:p>
       <w:pPr>
         <w:pBdr>
@@ -316,11 +391,12 @@
         </w:rPr>
         <w:t xml:space="preserve"> </w:t>
       </w:r>
-      <w:r>
-        <w:t xml:space="preserve"> {{ contacts }}</w:t>
-      </w:r>
-    </w:p>
-    <w:p/>
+    </w:p>
+    <w:p>
+      <w:r>
+        <w:t>{{ contacts }}</w:t>
+      </w:r>
+    </w:p>
     <w:p>
       <w:pPr>
         <w:pBdr>
@@ -352,11 +428,12 @@
         </w:rPr>
         <w:t xml:space="preserve">Department: </w:t>
       </w:r>
-      <w:r>
-        <w:t xml:space="preserve"> {{ department }}</w:t>
-      </w:r>
-    </w:p>
-    <w:p/>
+    </w:p>
+    <w:p>
+      <w:r>
+        <w:t>{{ department }}</w:t>
+      </w:r>
+    </w:p>
     <w:p>
       <w:pPr>
         <w:pBdr>
@@ -388,11 +465,12 @@
         </w:rPr>
         <w:t xml:space="preserve">Organization: </w:t>
       </w:r>
-      <w:r>
-        <w:t xml:space="preserve"> {{ organization }}</w:t>
-      </w:r>
-    </w:p>
-    <w:p/>
+    </w:p>
+    <w:p>
+      <w:r>
+        <w:t>{{ organization }}</w:t>
+      </w:r>
+    </w:p>
     <w:p>
       <w:pPr>
         <w:pBdr>
@@ -433,11 +511,12 @@
         </w:rPr>
         <w:t xml:space="preserve"> </w:t>
       </w:r>
-      <w:r>
-        <w:t xml:space="preserve"> {{ date_of_joining }}</w:t>
-      </w:r>
-    </w:p>
-    <w:p/>
+    </w:p>
+    <w:p>
+      <w:r>
+        <w:t>{{ date_of_joining }}</w:t>
+      </w:r>
+    </w:p>
     <w:p>
       <w:pPr>
         <w:rPr>
@@ -500,11 +579,12 @@
         </w:rPr>
         <w:t xml:space="preserve"> </w:t>
       </w:r>
-      <w:r>
-        <w:t xml:space="preserve"> {{ bank_name }}</w:t>
-      </w:r>
-    </w:p>
-    <w:p/>
+    </w:p>
+    <w:p>
+      <w:r>
+        <w:t>{{ bank_name }}</w:t>
+      </w:r>
+    </w:p>
     <w:p>
       <w:pPr>
         <w:pBdr>
@@ -548,11 +628,12 @@
         </w:rPr>
         <w:t xml:space="preserve"> </w:t>
       </w:r>
-      <w:r>
-        <w:t xml:space="preserve"> {{ bank_branch }}</w:t>
-      </w:r>
-    </w:p>
-    <w:p/>
+    </w:p>
+    <w:p>
+      <w:r>
+        <w:t>{{ bank_branch }}</w:t>
+      </w:r>
+    </w:p>
     <w:p>
       <w:pPr>
         <w:pBdr>
@@ -677,11 +758,12 @@
         </w:rPr>
         <w:tab/>
       </w:r>
-      <w:r>
-        <w:t xml:space="preserve"> {{ account_number }}</w:t>
-      </w:r>
-    </w:p>
-    <w:p/>
+    </w:p>
+    <w:p>
+      <w:r>
+        <w:t>{{ account_number }}</w:t>
+      </w:r>
+    </w:p>
     <w:p>
       <w:pPr>
         <w:pBdr>
@@ -691,9 +773,6 @@
           <w:right w:val="single" w:sz="4" w:space="4" w:color="auto"/>
           <w:between w:val="single" w:sz="4" w:space="1" w:color="auto"/>
         </w:pBdr>
-        <w:tabs>
-          <w:tab w:pos="4680" w:val="center"/>
-        </w:tabs>
         <w:rPr>
           <w:rFonts w:ascii="Times New Roman" w:hAnsi="Times New Roman"/>
           <w:b/>
@@ -703,17 +782,141 @@
         </w:rPr>
       </w:pPr>
       <w:r>
-        <w:t>Employee's Signature:</w:t>
-      </w:r>
-      <w:r>
-        <w:tab/>
-      </w:r>
-      <w:r>
-        <w:t>{{ employee_signature }}    Date: {{ employee_sign_date }}</w:t>
-      </w:r>
-    </w:p>
-    <w:p/>
-    <w:p/>
+        <w:rPr>
+          <w:rFonts w:ascii="Times New Roman" w:hAnsi="Times New Roman"/>
+          <w:b/>
+          <w:sz w:val="24"/>
+          <w:szCs w:val="24"/>
+        </w:rPr>
+        <w:t xml:space="preserve"> </w:t>
+      </w:r>
+      <w:r>
+        <w:rPr>
+          <w:rFonts w:ascii="Times New Roman" w:hAnsi="Times New Roman"/>
+          <w:b/>
+          <w:sz w:val="24"/>
+          <w:szCs w:val="24"/>
+        </w:rPr>
+        <w:t>Employee’s Signature:</w:t>
+      </w:r>
+      <w:r>
+        <w:rPr>
+          <w:rFonts w:ascii="Times New Roman" w:hAnsi="Times New Roman"/>
+          <w:b/>
+          <w:sz w:val="24"/>
+          <w:szCs w:val="24"/>
+        </w:rPr>
+        <w:tab/>
+      </w:r>
+      <w:r>
+        <w:rPr>
+          <w:rFonts w:ascii="Times New Roman" w:hAnsi="Times New Roman"/>
+          <w:b/>
+          <w:sz w:val="24"/>
+          <w:szCs w:val="24"/>
+        </w:rPr>
+        <w:tab/>
+      </w:r>
+      <w:r>
+        <w:rPr>
+          <w:rFonts w:ascii="Times New Roman" w:hAnsi="Times New Roman"/>
+          <w:b/>
+          <w:color w:val="D9D9D9"/>
+          <w:sz w:val="24"/>
+          <w:szCs w:val="24"/>
+        </w:rPr>
+        <w:t xml:space="preserve">Sign </w:t>
+      </w:r>
+      <w:r>
+        <w:rPr>
+          <w:rFonts w:ascii="Times New Roman" w:hAnsi="Times New Roman"/>
+          <w:b/>
+          <w:color w:val="D9D9D9"/>
+          <w:sz w:val="24"/>
+          <w:szCs w:val="24"/>
+        </w:rPr>
+        <w:tab/>
+      </w:r>
+      <w:r>
+        <w:rPr>
+          <w:rFonts w:ascii="Times New Roman" w:hAnsi="Times New Roman"/>
+          <w:b/>
+          <w:color w:val="000000"/>
+          <w:sz w:val="24"/>
+          <w:szCs w:val="24"/>
+        </w:rPr>
+        <w:tab/>
+      </w:r>
+      <w:r>
+        <w:rPr>
+          <w:rFonts w:ascii="Times New Roman" w:hAnsi="Times New Roman"/>
+          <w:b/>
+          <w:color w:val="000000"/>
+          <w:sz w:val="24"/>
+          <w:szCs w:val="24"/>
+        </w:rPr>
+        <w:tab/>
+      </w:r>
+      <w:r>
+        <w:rPr>
+          <w:rFonts w:ascii="Times New Roman" w:hAnsi="Times New Roman"/>
+          <w:b/>
+          <w:color w:val="000000"/>
+          <w:sz w:val="24"/>
+          <w:szCs w:val="24"/>
+        </w:rPr>
+        <w:tab/>
+        <w:t>Date</w:t>
+      </w:r>
+      <w:r>
+        <w:rPr>
+          <w:rFonts w:ascii="Times New Roman" w:hAnsi="Times New Roman"/>
+          <w:b/>
+          <w:color w:val="000000"/>
+          <w:sz w:val="24"/>
+          <w:szCs w:val="24"/>
+        </w:rPr>
+        <w:t xml:space="preserve">: </w:t>
+      </w:r>
+      <w:r>
+        <w:rPr>
+          <w:rFonts w:ascii="Times New Roman" w:hAnsi="Times New Roman"/>
+          <w:b/>
+          <w:color w:val="000000"/>
+          <w:sz w:val="24"/>
+          <w:szCs w:val="24"/>
+        </w:rPr>
+        <w:tab/>
+      </w:r>
+      <w:r>
+        <w:rPr>
+          <w:rFonts w:ascii="Times New Roman" w:hAnsi="Times New Roman"/>
+          <w:b/>
+          <w:sz w:val="24"/>
+          <w:szCs w:val="24"/>
+        </w:rPr>
+        <w:tab/>
+      </w:r>
+      <w:r>
+        <w:rPr>
+          <w:rFonts w:ascii="Times New Roman" w:hAnsi="Times New Roman"/>
+          <w:b/>
+          <w:sz w:val="24"/>
+          <w:szCs w:val="24"/>
+        </w:rPr>
+        <w:tab/>
+      </w:r>
+    </w:p>
+    <w:p>
+      <w:r>
+        <w:t>{{ employee_signature }}</w:t>
+      </w:r>
+    </w:p>
+    <w:p>
+      <w:r>
+        <w:t>Date: {{ employee_sign_date }}</w:t>
+      </w:r>
+    </w:p>
     <w:p>
       <w:pPr>
         <w:rPr>
@@ -776,11 +979,12 @@
         </w:rPr>
         <w:t>Name:</w:t>
       </w:r>
-      <w:r>
-        <w:t xml:space="preserve"> {{ reporting_to_name }}</w:t>
-      </w:r>
-    </w:p>
-    <w:p/>
+    </w:p>
+    <w:p>
+      <w:r>
+        <w:t>{{ reporting_to_name }}</w:t>
+      </w:r>
+    </w:p>
     <w:p>
       <w:pPr>
         <w:pBdr>
@@ -824,11 +1028,12 @@
         </w:rPr>
         <w:t>:</w:t>
       </w:r>
-      <w:r>
-        <w:t xml:space="preserve"> {{ reporting_to_designation }}</w:t>
-      </w:r>
-    </w:p>
-    <w:p/>
+    </w:p>
+    <w:p>
+      <w:r>
+        <w:t>{{ reporting_to_designation }}</w:t>
+      </w:r>
+    </w:p>
     <w:p>
       <w:pPr>
         <w:pBdr>
@@ -863,11 +1068,12 @@
         </w:rPr>
         <w:tab/>
       </w:r>
-      <w:r>
-        <w:t xml:space="preserve"> {{ reporting_to_contact }}</w:t>
-      </w:r>
-    </w:p>
-    <w:p/>
+    </w:p>
+    <w:p>
+      <w:r>
+        <w:t>{{ reporting_to_contact }}</w:t>
+      </w:r>
+    </w:p>
     <w:p>
       <w:pPr>
         <w:pBdr>
@@ -877,28 +1083,251 @@
           <w:right w:val="single" w:sz="4" w:space="4" w:color="auto"/>
           <w:between w:val="single" w:sz="4" w:space="1" w:color="auto"/>
         </w:pBdr>
-        <w:tabs>
-          <w:tab w:pos="4680" w:val="center"/>
-        </w:tabs>
-        <w:rPr>
-          <w:rFonts w:ascii="Times New Roman" w:hAnsi="Times New Roman"/>
-          <w:b/>
-          <w:sz w:val="24"/>
-          <w:szCs w:val="24"/>
-        </w:rPr>
-      </w:pPr>
-      <w:r>
+        <w:rPr>
+          <w:rFonts w:ascii="Times New Roman" w:hAnsi="Times New Roman"/>
+          <w:b/>
+          <w:sz w:val="24"/>
+          <w:szCs w:val="24"/>
+        </w:rPr>
+      </w:pPr>
+      <w:r>
+        <w:rPr>
+          <w:rFonts w:ascii="Times New Roman" w:hAnsi="Times New Roman"/>
+          <w:b/>
+          <w:sz w:val="24"/>
+          <w:szCs w:val="24"/>
+        </w:rPr>
+        <w:t xml:space="preserve"> </w:t>
+      </w:r>
+      <w:r>
+        <w:rPr>
+          <w:rFonts w:ascii="Times New Roman" w:hAnsi="Times New Roman"/>
+          <w:b/>
+          <w:sz w:val="24"/>
+          <w:szCs w:val="24"/>
+        </w:rPr>
         <w:t>Signature:</w:t>
       </w:r>
       <w:r>
-        <w:tab/>
-      </w:r>
-      <w:r>
-        <w:t>{{ reporting_to_signature }}    Date: {{ reporting_sign_date }}</w:t>
-      </w:r>
-    </w:p>
-    <w:p/>
-    <w:p/>
+        <w:rPr>
+          <w:rFonts w:ascii="Times New Roman" w:hAnsi="Times New Roman"/>
+          <w:b/>
+          <w:sz w:val="24"/>
+          <w:szCs w:val="24"/>
+        </w:rPr>
+        <w:tab/>
+      </w:r>
+      <w:r>
+        <w:rPr>
+          <w:rFonts w:ascii="Times New Roman" w:hAnsi="Times New Roman"/>
+          <w:b/>
+          <w:sz w:val="24"/>
+          <w:szCs w:val="24"/>
+        </w:rPr>
+        <w:tab/>
+      </w:r>
+      <w:r>
+        <w:rPr>
+          <w:rFonts w:ascii="Times New Roman" w:hAnsi="Times New Roman"/>
+          <w:b/>
+          <w:sz w:val="24"/>
+          <w:szCs w:val="24"/>
+        </w:rPr>
+        <w:tab/>
+      </w:r>
+      <w:r>
+        <w:rPr>
+          <w:rFonts w:ascii="Times New Roman" w:hAnsi="Times New Roman"/>
+          <w:b/>
+          <w:sz w:val="24"/>
+          <w:szCs w:val="24"/>
+        </w:rPr>
+        <w:tab/>
+      </w:r>
+      <w:r>
+        <w:rPr>
+          <w:rFonts w:ascii="Times New Roman" w:hAnsi="Times New Roman"/>
+          <w:b/>
+          <w:color w:val="D9D9D9"/>
+          <w:sz w:val="24"/>
+          <w:szCs w:val="24"/>
+        </w:rPr>
+        <w:t>Sign</w:t>
+      </w:r>
+      <w:r>
+        <w:rPr>
+          <w:rFonts w:ascii="Times New Roman" w:hAnsi="Times New Roman"/>
+          <w:b/>
+          <w:sz w:val="24"/>
+          <w:szCs w:val="24"/>
+        </w:rPr>
+        <w:tab/>
+      </w:r>
+      <w:r>
+        <w:rPr>
+          <w:rFonts w:ascii="Times New Roman" w:hAnsi="Times New Roman"/>
+          <w:b/>
+          <w:sz w:val="24"/>
+          <w:szCs w:val="24"/>
+        </w:rPr>
+        <w:tab/>
+      </w:r>
+      <w:r>
+        <w:rPr>
+          <w:rFonts w:ascii="Times New Roman" w:hAnsi="Times New Roman"/>
+          <w:b/>
+          <w:sz w:val="24"/>
+          <w:szCs w:val="24"/>
+        </w:rPr>
+        <w:tab/>
+      </w:r>
+      <w:r>
+        <w:rPr>
+          <w:rFonts w:ascii="Times New Roman" w:hAnsi="Times New Roman"/>
+          <w:b/>
+          <w:sz w:val="24"/>
+          <w:szCs w:val="24"/>
+        </w:rPr>
+        <w:tab/>
+      </w:r>
+      <w:r>
+        <w:rPr>
+          <w:rFonts w:ascii="Times New Roman" w:hAnsi="Times New Roman"/>
+          <w:b/>
+          <w:color w:val="000000"/>
+          <w:sz w:val="24"/>
+          <w:szCs w:val="24"/>
+        </w:rPr>
+        <w:t>Date:</w:t>
+      </w:r>
+      <w:r>
+        <w:rPr>
+          <w:rFonts w:ascii="Times New Roman" w:hAnsi="Times New Roman"/>
+          <w:b/>
+          <w:sz w:val="24"/>
+          <w:szCs w:val="24"/>
+        </w:rPr>
+        <w:tab/>
+      </w:r>
+      <w:r>
+        <w:rPr>
+          <w:rFonts w:ascii="Times New Roman" w:hAnsi="Times New Roman"/>
+          <w:b/>
+          <w:sz w:val="24"/>
+          <w:szCs w:val="24"/>
+        </w:rPr>
+        <w:tab/>
+      </w:r>
+      <w:r>
+        <w:rPr>
+          <w:rFonts w:ascii="Times New Roman" w:hAnsi="Times New Roman"/>
+          <w:b/>
+          <w:sz w:val="24"/>
+          <w:szCs w:val="24"/>
+        </w:rPr>
+        <w:tab/>
+      </w:r>
+      <w:r>
+        <w:rPr>
+          <w:rFonts w:ascii="Times New Roman" w:hAnsi="Times New Roman"/>
+          <w:b/>
+          <w:sz w:val="24"/>
+          <w:szCs w:val="24"/>
+        </w:rPr>
+        <w:tab/>
+      </w:r>
+      <w:r>
+        <w:rPr>
+          <w:rFonts w:ascii="Times New Roman" w:hAnsi="Times New Roman"/>
+          <w:b/>
+          <w:sz w:val="24"/>
+          <w:szCs w:val="24"/>
+        </w:rPr>
+        <w:tab/>
+      </w:r>
+      <w:r>
+        <w:rPr>
+          <w:rFonts w:ascii="Times New Roman" w:hAnsi="Times New Roman"/>
+          <w:b/>
+          <w:sz w:val="24"/>
+          <w:szCs w:val="24"/>
+        </w:rPr>
+        <w:tab/>
+      </w:r>
+      <w:r>
+        <w:rPr>
+          <w:rFonts w:ascii="Times New Roman" w:hAnsi="Times New Roman"/>
+          <w:b/>
+          <w:sz w:val="24"/>
+          <w:szCs w:val="24"/>
+        </w:rPr>
+        <w:tab/>
+      </w:r>
+      <w:r>
+        <w:rPr>
+          <w:rFonts w:ascii="Times New Roman" w:hAnsi="Times New Roman"/>
+          <w:b/>
+          <w:sz w:val="24"/>
+          <w:szCs w:val="24"/>
+        </w:rPr>
+        <w:tab/>
+      </w:r>
+      <w:r>
+        <w:rPr>
+          <w:rFonts w:ascii="Times New Roman" w:hAnsi="Times New Roman"/>
+          <w:b/>
+          <w:sz w:val="24"/>
+          <w:szCs w:val="24"/>
+        </w:rPr>
+        <w:tab/>
+      </w:r>
+      <w:r>
+        <w:rPr>
+          <w:rFonts w:ascii="Times New Roman" w:hAnsi="Times New Roman"/>
+          <w:b/>
+          <w:sz w:val="24"/>
+          <w:szCs w:val="24"/>
+        </w:rPr>
+        <w:tab/>
+      </w:r>
+      <w:r>
+        <w:rPr>
+          <w:rFonts w:ascii="Times New Roman" w:hAnsi="Times New Roman"/>
+          <w:b/>
+          <w:sz w:val="24"/>
+          <w:szCs w:val="24"/>
+        </w:rPr>
+        <w:tab/>
+      </w:r>
+      <w:r>
+        <w:rPr>
+          <w:rFonts w:ascii="Times New Roman" w:hAnsi="Times New Roman"/>
+          <w:b/>
+          <w:sz w:val="24"/>
+          <w:szCs w:val="24"/>
+        </w:rPr>
+        <w:tab/>
+      </w:r>
+      <w:r>
+        <w:rPr>
+          <w:rFonts w:ascii="Times New Roman" w:hAnsi="Times New Roman"/>
+          <w:b/>
+          <w:sz w:val="24"/>
+          <w:szCs w:val="24"/>
+        </w:rPr>
+        <w:tab/>
+      </w:r>
+    </w:p>
+    <w:p>
+      <w:r>
+        <w:t>{{ reporting_to_signature }}</w:t>
+      </w:r>
+    </w:p>
+    <w:p>
+      <w:r>
+        <w:t>Date: {{ reporting_sign_date }}</w:t>
+      </w:r>
+    </w:p>
     <w:p>
       <w:pPr>
         <w:jc w:val="both"/>

</xml_diff>